<commit_message>
added enabled migration and config flag
</commit_message>
<xml_diff>
--- a/Documentation/Readme-From-MakarandVichare.docx
+++ b/Documentation/Readme-From-MakarandVichare.docx
@@ -294,6 +294,7 @@
     <w:p>
       <w:pPr>
         <w:numPr>
+          <w:ilvl w:val="0"/>
           <w:numId w:val="0"/>
         </w:numPr>
         <w:ind w:left="1260" w:leftChars="0"/>
@@ -471,6 +472,76 @@
     <w:p>
       <w:pPr>
         <w:numPr>
+          <w:ilvl w:val="0"/>
+          <w:numId w:val="2"/>
+        </w:numPr>
+        <w:ind w:left="1265" w:leftChars="0" w:hanging="425" w:firstLineChars="0"/>
+        <w:rPr>
+          <w:rFonts w:hint="default"/>
+          <w:lang w:val="en-GB"/>
+        </w:rPr>
+      </w:pPr>
+      <w:r>
+        <w:rPr>
+          <w:rFonts w:hint="default"/>
+          <w:lang w:val="en-GB"/>
+        </w:rPr>
+        <w:t>open developer command prompt</w:t>
+      </w:r>
+    </w:p>
+    <w:p>
+      <w:pPr>
+        <w:numPr>
+          <w:ilvl w:val="0"/>
+          <w:numId w:val="2"/>
+        </w:numPr>
+        <w:ind w:left="1265" w:leftChars="0" w:hanging="425" w:firstLineChars="0"/>
+        <w:rPr>
+          <w:rFonts w:hint="default"/>
+          <w:lang w:val="en-GB"/>
+        </w:rPr>
+      </w:pPr>
+      <w:r>
+        <w:rPr>
+          <w:rFonts w:hint="default"/>
+          <w:lang w:val="en-GB"/>
+        </w:rPr>
+        <w:t>CD D:\2025\PracticeRepos\DotNetFundAdminApiSample\FundAdministration.API&gt; goto this  folder</w:t>
+      </w:r>
+    </w:p>
+    <w:p>
+      <w:pPr>
+        <w:numPr>
+          <w:ilvl w:val="0"/>
+          <w:numId w:val="2"/>
+        </w:numPr>
+        <w:ind w:left="1265" w:leftChars="0" w:hanging="425" w:firstLineChars="0"/>
+        <w:rPr>
+          <w:rFonts w:hint="default" w:ascii="Arial Nova Cond" w:hAnsi="Arial Nova Cond" w:cs="Arial Nova Cond"/>
+          <w:lang w:val="en-GB"/>
+        </w:rPr>
+      </w:pPr>
+      <w:r>
+        <w:rPr>
+          <w:rFonts w:hint="default"/>
+          <w:lang w:val="en-GB"/>
+        </w:rPr>
+        <w:t xml:space="preserve">run this command - </w:t>
+      </w:r>
+      <w:bookmarkStart w:id="0" w:name="_GoBack"/>
+      <w:r>
+        <w:rPr>
+          <w:rFonts w:hint="default"/>
+          <w:lang w:val="en-GB"/>
+        </w:rPr>
+        <w:t>dotnet ef migrations add InitialCreate -c AppDbContext -p ../FundAdministration.Infrastructure/FundAdministration.Infrastructure.csproj -s FundAdministration.API.csproj -o Data/Migrations</w:t>
+      </w:r>
+      <w:bookmarkEnd w:id="0"/>
+    </w:p>
+    <w:p>
+      <w:pPr>
+        <w:numPr>
+          <w:ilvl w:val="0"/>
           <w:numId w:val="0"/>
         </w:numPr>
         <w:ind w:left="840" w:leftChars="0"/>
@@ -483,6 +554,7 @@
     <w:p>
       <w:pPr>
         <w:numPr>
+          <w:ilvl w:val="0"/>
           <w:numId w:val="0"/>
         </w:numPr>
         <w:ind w:left="840" w:leftChars="0"/>
@@ -495,6 +567,7 @@
     <w:p>
       <w:pPr>
         <w:numPr>
+          <w:ilvl w:val="0"/>
           <w:numId w:val="0"/>
         </w:numPr>
         <w:ind w:left="840" w:leftChars="0"/>
@@ -514,12 +587,11 @@
         </w:rPr>
         <w:t>Features Covered</w:t>
       </w:r>
-      <w:bookmarkStart w:id="0" w:name="_GoBack"/>
-      <w:bookmarkEnd w:id="0"/>
-    </w:p>
-    <w:p>
-      <w:pPr>
-        <w:numPr>
+    </w:p>
+    <w:p>
+      <w:pPr>
+        <w:numPr>
+          <w:ilvl w:val="0"/>
           <w:numId w:val="0"/>
         </w:numPr>
         <w:ind w:left="840" w:leftChars="0"/>
@@ -614,18 +686,7 @@
           <w:iCs w:val="0"/>
           <w:lang w:val="en-GB"/>
         </w:rPr>
-        <w:t xml:space="preserve"> - </w:t>
-      </w:r>
-      <w:r>
-        <w:rPr>
-          <w:rFonts w:hint="default" w:ascii="Arial Nova Cond" w:hAnsi="Arial Nova Cond" w:cs="Arial Nova Cond"/>
-          <w:b w:val="0"/>
-          <w:bCs w:val="0"/>
-          <w:i w:val="0"/>
-          <w:iCs w:val="0"/>
-          <w:lang w:val="en-GB"/>
-        </w:rPr>
-        <w:t>FundTests</w:t>
+        <w:t xml:space="preserve"> - FundTests</w:t>
       </w:r>
     </w:p>
     <w:p>
@@ -1113,6 +1174,7 @@
     <w:p>
       <w:pPr>
         <w:numPr>
+          <w:ilvl w:val="0"/>
           <w:numId w:val="0"/>
         </w:numPr>
         <w:ind w:left="1260" w:leftChars="0"/>
@@ -1125,6 +1187,7 @@
     <w:p>
       <w:pPr>
         <w:numPr>
+          <w:ilvl w:val="0"/>
           <w:numId w:val="0"/>
         </w:numPr>
         <w:ind w:left="1680" w:leftChars="0"/>
@@ -1137,6 +1200,7 @@
     <w:p>
       <w:pPr>
         <w:numPr>
+          <w:ilvl w:val="0"/>
           <w:numId w:val="0"/>
         </w:numPr>
         <w:ind w:left="1680" w:leftChars="0"/>

</xml_diff>